<commit_message>
front page skeleton created
</commit_message>
<xml_diff>
--- a/Sprint 2 Document.docx
+++ b/Sprint 2 Document.docx
@@ -48,7 +48,7 @@
         </w:rPr>
         <w:t xml:space="preserve">GitHub Repository link: </w:t>
       </w:r>
-      <w:hyperlink r:id="rId6" w:tgtFrame="_blank" w:history="1">
+      <w:hyperlink r:id="rId8" w:tgtFrame="_blank" w:history="1">
         <w:r>
           <w:rPr>
             <w:rStyle w:val="Hyperlink"/>
@@ -73,7 +73,7 @@
         </w:rPr>
         <w:t xml:space="preserve">Project Board: </w:t>
       </w:r>
-      <w:hyperlink r:id="rId7" w:tgtFrame="_blank" w:history="1">
+      <w:hyperlink r:id="rId9" w:tgtFrame="_blank" w:history="1">
         <w:r>
           <w:rPr>
             <w:rStyle w:val="Hyperlink"/>
@@ -210,7 +210,7 @@
           <w:r>
             <w:fldChar w:fldCharType="separate"/>
           </w:r>
-          <w:hyperlink w:anchor="_Toc222828637" w:history="1">
+          <w:hyperlink w:anchor="_Toc222838817" w:history="1">
             <w:r>
               <w:rPr>
                 <w:rStyle w:val="Hyperlink"/>
@@ -239,7 +239,7 @@
                 <w:noProof/>
                 <w:webHidden/>
               </w:rPr>
-              <w:instrText xml:space="preserve"> PAGEREF _Toc222828637 \h </w:instrText>
+              <w:instrText xml:space="preserve"> PAGEREF _Toc222838817 \h </w:instrText>
             </w:r>
             <w:r>
               <w:rPr>
@@ -282,7 +282,7 @@
               <w:lang w:eastAsia="en-GB"/>
             </w:rPr>
           </w:pPr>
-          <w:hyperlink w:anchor="_Toc222828638" w:history="1">
+          <w:hyperlink w:anchor="_Toc222838818" w:history="1">
             <w:r>
               <w:rPr>
                 <w:rStyle w:val="Hyperlink"/>
@@ -309,7 +309,7 @@
                 <w:noProof/>
                 <w:webHidden/>
               </w:rPr>
-              <w:instrText xml:space="preserve"> PAGEREF _Toc222828638 \h </w:instrText>
+              <w:instrText xml:space="preserve"> PAGEREF _Toc222838818 \h </w:instrText>
             </w:r>
             <w:r>
               <w:rPr>
@@ -352,7 +352,7 @@
               <w:lang w:eastAsia="en-GB"/>
             </w:rPr>
           </w:pPr>
-          <w:hyperlink w:anchor="_Toc222828639" w:history="1">
+          <w:hyperlink w:anchor="_Toc222838819" w:history="1">
             <w:r>
               <w:rPr>
                 <w:rStyle w:val="Hyperlink"/>
@@ -379,7 +379,7 @@
                 <w:noProof/>
                 <w:webHidden/>
               </w:rPr>
-              <w:instrText xml:space="preserve"> PAGEREF _Toc222828639 \h </w:instrText>
+              <w:instrText xml:space="preserve"> PAGEREF _Toc222838819 \h </w:instrText>
             </w:r>
             <w:r>
               <w:rPr>
@@ -422,7 +422,7 @@
               <w:lang w:eastAsia="en-GB"/>
             </w:rPr>
           </w:pPr>
-          <w:hyperlink w:anchor="_Toc222828640" w:history="1">
+          <w:hyperlink w:anchor="_Toc222838820" w:history="1">
             <w:r>
               <w:rPr>
                 <w:rStyle w:val="Hyperlink"/>
@@ -451,7 +451,7 @@
                 <w:noProof/>
                 <w:webHidden/>
               </w:rPr>
-              <w:instrText xml:space="preserve"> PAGEREF _Toc222828640 \h </w:instrText>
+              <w:instrText xml:space="preserve"> PAGEREF _Toc222838820 \h </w:instrText>
             </w:r>
             <w:r>
               <w:rPr>
@@ -494,7 +494,7 @@
               <w:lang w:eastAsia="en-GB"/>
             </w:rPr>
           </w:pPr>
-          <w:hyperlink w:anchor="_Toc222828641" w:history="1">
+          <w:hyperlink w:anchor="_Toc222838821" w:history="1">
             <w:r>
               <w:rPr>
                 <w:rStyle w:val="Hyperlink"/>
@@ -523,7 +523,7 @@
                 <w:noProof/>
                 <w:webHidden/>
               </w:rPr>
-              <w:instrText xml:space="preserve"> PAGEREF _Toc222828641 \h </w:instrText>
+              <w:instrText xml:space="preserve"> PAGEREF _Toc222838821 \h </w:instrText>
             </w:r>
             <w:r>
               <w:rPr>
@@ -566,7 +566,7 @@
               <w:lang w:eastAsia="en-GB"/>
             </w:rPr>
           </w:pPr>
-          <w:hyperlink w:anchor="_Toc222828642" w:history="1">
+          <w:hyperlink w:anchor="_Toc222838822" w:history="1">
             <w:r>
               <w:rPr>
                 <w:rStyle w:val="Hyperlink"/>
@@ -595,7 +595,7 @@
                 <w:noProof/>
                 <w:webHidden/>
               </w:rPr>
-              <w:instrText xml:space="preserve"> PAGEREF _Toc222828642 \h </w:instrText>
+              <w:instrText xml:space="preserve"> PAGEREF _Toc222838822 \h </w:instrText>
             </w:r>
             <w:r>
               <w:rPr>
@@ -638,13 +638,13 @@
               <w:lang w:eastAsia="en-GB"/>
             </w:rPr>
           </w:pPr>
-          <w:hyperlink w:anchor="_Toc222828643" w:history="1">
+          <w:hyperlink w:anchor="_Toc222838823" w:history="1">
             <w:r>
               <w:rPr>
                 <w:rStyle w:val="Hyperlink"/>
                 <w:noProof/>
               </w:rPr>
-              <w:t>View Users List</w:t>
+              <w:t>Login Page</w:t>
             </w:r>
             <w:r>
               <w:rPr>
@@ -665,7 +665,7 @@
                 <w:noProof/>
                 <w:webHidden/>
               </w:rPr>
-              <w:instrText xml:space="preserve"> PAGEREF _Toc222828643 \h </w:instrText>
+              <w:instrText xml:space="preserve"> PAGEREF _Toc222838823 \h </w:instrText>
             </w:r>
             <w:r>
               <w:rPr>
@@ -708,13 +708,13 @@
               <w:lang w:eastAsia="en-GB"/>
             </w:rPr>
           </w:pPr>
-          <w:hyperlink w:anchor="_Toc222828644" w:history="1">
+          <w:hyperlink w:anchor="_Toc222838824" w:history="1">
             <w:r>
               <w:rPr>
                 <w:rStyle w:val="Hyperlink"/>
                 <w:noProof/>
               </w:rPr>
-              <w:t>View User Profile</w:t>
+              <w:t>View Posts Lists</w:t>
             </w:r>
             <w:r>
               <w:rPr>
@@ -735,7 +735,7 @@
                 <w:noProof/>
                 <w:webHidden/>
               </w:rPr>
-              <w:instrText xml:space="preserve"> PAGEREF _Toc222828644 \h </w:instrText>
+              <w:instrText xml:space="preserve"> PAGEREF _Toc222838824 \h </w:instrText>
             </w:r>
             <w:r>
               <w:rPr>
@@ -756,216 +756,6 @@
                 <w:webHidden/>
               </w:rPr>
               <w:t>6</w:t>
-            </w:r>
-            <w:r>
-              <w:rPr>
-                <w:noProof/>
-                <w:webHidden/>
-              </w:rPr>
-              <w:fldChar w:fldCharType="end"/>
-            </w:r>
-          </w:hyperlink>
-        </w:p>
-        <w:p>
-          <w:pPr>
-            <w:pStyle w:val="TOC3"/>
-            <w:tabs>
-              <w:tab w:val="right" w:leader="dot" w:pos="9016"/>
-            </w:tabs>
-            <w:rPr>
-              <w:rFonts w:eastAsiaTheme="minorEastAsia"/>
-              <w:noProof/>
-              <w:lang w:eastAsia="en-GB"/>
-            </w:rPr>
-          </w:pPr>
-          <w:hyperlink w:anchor="_Toc222828645" w:history="1">
-            <w:r>
-              <w:rPr>
-                <w:rStyle w:val="Hyperlink"/>
-                <w:noProof/>
-              </w:rPr>
-              <w:t>View Posts Lists</w:t>
-            </w:r>
-            <w:r>
-              <w:rPr>
-                <w:noProof/>
-                <w:webHidden/>
-              </w:rPr>
-              <w:tab/>
-            </w:r>
-            <w:r>
-              <w:rPr>
-                <w:noProof/>
-                <w:webHidden/>
-              </w:rPr>
-              <w:fldChar w:fldCharType="begin"/>
-            </w:r>
-            <w:r>
-              <w:rPr>
-                <w:noProof/>
-                <w:webHidden/>
-              </w:rPr>
-              <w:instrText xml:space="preserve"> PAGEREF _Toc222828645 \h </w:instrText>
-            </w:r>
-            <w:r>
-              <w:rPr>
-                <w:noProof/>
-                <w:webHidden/>
-              </w:rPr>
-            </w:r>
-            <w:r>
-              <w:rPr>
-                <w:noProof/>
-                <w:webHidden/>
-              </w:rPr>
-              <w:fldChar w:fldCharType="separate"/>
-            </w:r>
-            <w:r>
-              <w:rPr>
-                <w:noProof/>
-                <w:webHidden/>
-              </w:rPr>
-              <w:t>7</w:t>
-            </w:r>
-            <w:r>
-              <w:rPr>
-                <w:noProof/>
-                <w:webHidden/>
-              </w:rPr>
-              <w:fldChar w:fldCharType="end"/>
-            </w:r>
-          </w:hyperlink>
-        </w:p>
-        <w:p>
-          <w:pPr>
-            <w:pStyle w:val="TOC3"/>
-            <w:tabs>
-              <w:tab w:val="right" w:leader="dot" w:pos="9016"/>
-            </w:tabs>
-            <w:rPr>
-              <w:rFonts w:eastAsiaTheme="minorEastAsia"/>
-              <w:noProof/>
-              <w:lang w:eastAsia="en-GB"/>
-            </w:rPr>
-          </w:pPr>
-          <w:hyperlink w:anchor="_Toc222828646" w:history="1">
-            <w:r>
-              <w:rPr>
-                <w:rStyle w:val="Hyperlink"/>
-                <w:noProof/>
-              </w:rPr>
-              <w:t>View Post Details</w:t>
-            </w:r>
-            <w:r>
-              <w:rPr>
-                <w:noProof/>
-                <w:webHidden/>
-              </w:rPr>
-              <w:tab/>
-            </w:r>
-            <w:r>
-              <w:rPr>
-                <w:noProof/>
-                <w:webHidden/>
-              </w:rPr>
-              <w:fldChar w:fldCharType="begin"/>
-            </w:r>
-            <w:r>
-              <w:rPr>
-                <w:noProof/>
-                <w:webHidden/>
-              </w:rPr>
-              <w:instrText xml:space="preserve"> PAGEREF _Toc222828646 \h </w:instrText>
-            </w:r>
-            <w:r>
-              <w:rPr>
-                <w:noProof/>
-                <w:webHidden/>
-              </w:rPr>
-            </w:r>
-            <w:r>
-              <w:rPr>
-                <w:noProof/>
-                <w:webHidden/>
-              </w:rPr>
-              <w:fldChar w:fldCharType="separate"/>
-            </w:r>
-            <w:r>
-              <w:rPr>
-                <w:noProof/>
-                <w:webHidden/>
-              </w:rPr>
-              <w:t>8</w:t>
-            </w:r>
-            <w:r>
-              <w:rPr>
-                <w:noProof/>
-                <w:webHidden/>
-              </w:rPr>
-              <w:fldChar w:fldCharType="end"/>
-            </w:r>
-          </w:hyperlink>
-        </w:p>
-        <w:p>
-          <w:pPr>
-            <w:pStyle w:val="TOC3"/>
-            <w:tabs>
-              <w:tab w:val="right" w:leader="dot" w:pos="9016"/>
-            </w:tabs>
-            <w:rPr>
-              <w:rFonts w:eastAsiaTheme="minorEastAsia"/>
-              <w:noProof/>
-              <w:lang w:eastAsia="en-GB"/>
-            </w:rPr>
-          </w:pPr>
-          <w:hyperlink w:anchor="_Toc222828647" w:history="1">
-            <w:r>
-              <w:rPr>
-                <w:rStyle w:val="Hyperlink"/>
-                <w:noProof/>
-              </w:rPr>
-              <w:t>Filter By Category</w:t>
-            </w:r>
-            <w:r>
-              <w:rPr>
-                <w:noProof/>
-                <w:webHidden/>
-              </w:rPr>
-              <w:tab/>
-            </w:r>
-            <w:r>
-              <w:rPr>
-                <w:noProof/>
-                <w:webHidden/>
-              </w:rPr>
-              <w:fldChar w:fldCharType="begin"/>
-            </w:r>
-            <w:r>
-              <w:rPr>
-                <w:noProof/>
-                <w:webHidden/>
-              </w:rPr>
-              <w:instrText xml:space="preserve"> PAGEREF _Toc222828647 \h </w:instrText>
-            </w:r>
-            <w:r>
-              <w:rPr>
-                <w:noProof/>
-                <w:webHidden/>
-              </w:rPr>
-            </w:r>
-            <w:r>
-              <w:rPr>
-                <w:noProof/>
-                <w:webHidden/>
-              </w:rPr>
-              <w:fldChar w:fldCharType="separate"/>
-            </w:r>
-            <w:r>
-              <w:rPr>
-                <w:noProof/>
-                <w:webHidden/>
-              </w:rPr>
-              <w:t>9</w:t>
             </w:r>
             <w:r>
               <w:rPr>
@@ -988,7 +778,7 @@
               <w:lang w:eastAsia="en-GB"/>
             </w:rPr>
           </w:pPr>
-          <w:hyperlink w:anchor="_Toc222828648" w:history="1">
+          <w:hyperlink w:anchor="_Toc222838825" w:history="1">
             <w:r>
               <w:rPr>
                 <w:rStyle w:val="Hyperlink"/>
@@ -996,7 +786,7 @@
                 <w:bCs/>
                 <w:noProof/>
               </w:rPr>
-              <w:t>Section 6: Kanban Board Screenshot</w:t>
+              <w:t>Section 5: ERD diagram</w:t>
             </w:r>
             <w:r>
               <w:rPr>
@@ -1017,7 +807,7 @@
                 <w:noProof/>
                 <w:webHidden/>
               </w:rPr>
-              <w:instrText xml:space="preserve"> PAGEREF _Toc222828648 \h </w:instrText>
+              <w:instrText xml:space="preserve"> PAGEREF _Toc222838825 \h </w:instrText>
             </w:r>
             <w:r>
               <w:rPr>
@@ -1037,7 +827,7 @@
                 <w:noProof/>
                 <w:webHidden/>
               </w:rPr>
-              <w:t>10</w:t>
+              <w:t>7</w:t>
             </w:r>
             <w:r>
               <w:rPr>
@@ -1060,7 +850,7 @@
               <w:lang w:eastAsia="en-GB"/>
             </w:rPr>
           </w:pPr>
-          <w:hyperlink w:anchor="_Toc222828649" w:history="1">
+          <w:hyperlink w:anchor="_Toc222838826" w:history="1">
             <w:r>
               <w:rPr>
                 <w:rStyle w:val="Hyperlink"/>
@@ -1068,6 +858,78 @@
                 <w:bCs/>
                 <w:noProof/>
               </w:rPr>
+              <w:t>Section 6: Kanban Board Screenshot</w:t>
+            </w:r>
+            <w:r>
+              <w:rPr>
+                <w:noProof/>
+                <w:webHidden/>
+              </w:rPr>
+              <w:tab/>
+            </w:r>
+            <w:r>
+              <w:rPr>
+                <w:noProof/>
+                <w:webHidden/>
+              </w:rPr>
+              <w:fldChar w:fldCharType="begin"/>
+            </w:r>
+            <w:r>
+              <w:rPr>
+                <w:noProof/>
+                <w:webHidden/>
+              </w:rPr>
+              <w:instrText xml:space="preserve"> PAGEREF _Toc222838826 \h </w:instrText>
+            </w:r>
+            <w:r>
+              <w:rPr>
+                <w:noProof/>
+                <w:webHidden/>
+              </w:rPr>
+            </w:r>
+            <w:r>
+              <w:rPr>
+                <w:noProof/>
+                <w:webHidden/>
+              </w:rPr>
+              <w:fldChar w:fldCharType="separate"/>
+            </w:r>
+            <w:r>
+              <w:rPr>
+                <w:noProof/>
+                <w:webHidden/>
+              </w:rPr>
+              <w:t>8</w:t>
+            </w:r>
+            <w:r>
+              <w:rPr>
+                <w:noProof/>
+                <w:webHidden/>
+              </w:rPr>
+              <w:fldChar w:fldCharType="end"/>
+            </w:r>
+          </w:hyperlink>
+        </w:p>
+        <w:p>
+          <w:pPr>
+            <w:pStyle w:val="TOC2"/>
+            <w:tabs>
+              <w:tab w:val="right" w:leader="dot" w:pos="9016"/>
+            </w:tabs>
+            <w:rPr>
+              <w:rFonts w:eastAsiaTheme="minorEastAsia"/>
+              <w:noProof/>
+              <w:lang w:eastAsia="en-GB"/>
+            </w:rPr>
+          </w:pPr>
+          <w:hyperlink w:anchor="_Toc222838827" w:history="1">
+            <w:r>
+              <w:rPr>
+                <w:rStyle w:val="Hyperlink"/>
+                <w:b/>
+                <w:bCs/>
+                <w:noProof/>
+              </w:rPr>
               <w:t>Section 7: Meeting Records</w:t>
             </w:r>
             <w:r>
@@ -1089,7 +951,7 @@
                 <w:noProof/>
                 <w:webHidden/>
               </w:rPr>
-              <w:instrText xml:space="preserve"> PAGEREF _Toc222828649 \h </w:instrText>
+              <w:instrText xml:space="preserve"> PAGEREF _Toc222838827 \h </w:instrText>
             </w:r>
             <w:r>
               <w:rPr>
@@ -1109,7 +971,7 @@
                 <w:noProof/>
                 <w:webHidden/>
               </w:rPr>
-              <w:t>10</w:t>
+              <w:t>8</w:t>
             </w:r>
             <w:r>
               <w:rPr>
@@ -1196,7 +1058,7 @@
           <w:bCs/>
         </w:rPr>
       </w:pPr>
-      <w:bookmarkStart w:id="0" w:name="_Toc222828637"/>
+      <w:bookmarkStart w:id="0" w:name="_Toc222838817"/>
       <w:r>
         <w:rPr>
           <w:b/>
@@ -1218,7 +1080,7 @@
       <w:pPr>
         <w:pStyle w:val="Heading3"/>
       </w:pPr>
-      <w:bookmarkStart w:id="1" w:name="_Toc222828638"/>
+      <w:bookmarkStart w:id="1" w:name="_Toc222838818"/>
       <w:r>
         <w:t>User Authentication and Profiles</w:t>
       </w:r>
@@ -1414,7 +1276,7 @@
       <w:pPr>
         <w:pStyle w:val="Heading3"/>
       </w:pPr>
-      <w:bookmarkStart w:id="2" w:name="_Toc222828639"/>
+      <w:bookmarkStart w:id="2" w:name="_Toc222838819"/>
       <w:r>
         <w:t>Cultural content (Sprint 3 focus)</w:t>
       </w:r>
@@ -1728,7 +1590,7 @@
           <w:bCs/>
         </w:rPr>
       </w:pPr>
-      <w:bookmarkStart w:id="3" w:name="_Toc222828640"/>
+      <w:bookmarkStart w:id="3" w:name="_Toc222838820"/>
       <w:r>
         <w:rPr>
           <w:b/>
@@ -1765,7 +1627,7 @@
                     <pic:cNvPicPr/>
                   </pic:nvPicPr>
                   <pic:blipFill>
-                    <a:blip r:embed="rId8"/>
+                    <a:blip r:embed="rId10"/>
                     <a:stretch>
                       <a:fillRect/>
                     </a:stretch>
@@ -1803,7 +1665,7 @@
           <w:bCs/>
         </w:rPr>
       </w:pPr>
-      <w:bookmarkStart w:id="4" w:name="_Toc222828641"/>
+      <w:bookmarkStart w:id="4" w:name="_Toc222838821"/>
       <w:r>
         <w:rPr>
           <w:b/>
@@ -1842,7 +1704,7 @@
                     <pic:cNvPicPr/>
                   </pic:nvPicPr>
                   <pic:blipFill>
-                    <a:blip r:embed="rId9"/>
+                    <a:blip r:embed="rId11"/>
                     <a:stretch>
                       <a:fillRect/>
                     </a:stretch>
@@ -1884,7 +1746,7 @@
                     <pic:cNvPicPr/>
                   </pic:nvPicPr>
                   <pic:blipFill>
-                    <a:blip r:embed="rId10"/>
+                    <a:blip r:embed="rId12"/>
                     <a:stretch>
                       <a:fillRect/>
                     </a:stretch>
@@ -1915,7 +1777,7 @@
           <w:bCs/>
         </w:rPr>
       </w:pPr>
-      <w:bookmarkStart w:id="5" w:name="_Toc222828642"/>
+      <w:bookmarkStart w:id="5" w:name="_Toc222838822"/>
       <w:r>
         <w:rPr>
           <w:b/>
@@ -1930,799 +1792,239 @@
       <w:pPr>
         <w:pStyle w:val="Heading3"/>
       </w:pPr>
-      <w:bookmarkStart w:id="6" w:name="_Toc222828643"/>
-      <w:r>
-        <w:t>View Users List</w:t>
+      <w:bookmarkStart w:id="6" w:name="_Toc222838823"/>
+      <w:r>
+        <w:t>Login Page</w:t>
       </w:r>
       <w:bookmarkEnd w:id="6"/>
-    </w:p>
-    <w:p>
-      <w:r>
-        <w:t>START</w:t>
-      </w:r>
-    </w:p>
-    <w:p>
-      <w:r>
-        <w:t xml:space="preserve">    │</w:t>
-      </w:r>
-    </w:p>
-    <w:p>
-      <w:r>
-        <w:t xml:space="preserve">    </w:t>
-      </w:r>
-      <w:r>
-        <w:rPr>
-          <w:rFonts w:ascii="Arial" w:hAnsi="Arial" w:cs="Arial"/>
-        </w:rPr>
-        <w:t>▼</w:t>
-      </w:r>
-    </w:p>
-    <w:p>
-      <w:r>
-        <w:t>User clicks "Community Members"</w:t>
-      </w:r>
-    </w:p>
-    <w:p>
-      <w:r>
-        <w:t xml:space="preserve">    │</w:t>
-      </w:r>
-    </w:p>
-    <w:p>
-      <w:r>
-        <w:t xml:space="preserve">    </w:t>
-      </w:r>
-      <w:r>
-        <w:rPr>
-          <w:rFonts w:ascii="Arial" w:hAnsi="Arial" w:cs="Arial"/>
-        </w:rPr>
-        <w:t>▼</w:t>
-      </w:r>
-    </w:p>
-    <w:p>
-      <w:r>
-        <w:t>System queries DB: SELECT * FROM users</w:t>
-      </w:r>
-    </w:p>
-    <w:p>
-      <w:r>
-        <w:t xml:space="preserve">    │</w:t>
-      </w:r>
-    </w:p>
-    <w:p>
-      <w:r>
-        <w:t xml:space="preserve">    </w:t>
-      </w:r>
-      <w:r>
-        <w:rPr>
-          <w:rFonts w:ascii="Arial" w:hAnsi="Arial" w:cs="Arial"/>
-        </w:rPr>
-        <w:t>▼</w:t>
-      </w:r>
-    </w:p>
-    <w:p>
-      <w:r>
-        <w:t>System displays list of all users</w:t>
-      </w:r>
-    </w:p>
-    <w:p>
-      <w:r>
-        <w:t xml:space="preserve">    │</w:t>
-      </w:r>
-    </w:p>
-    <w:p>
-      <w:r>
-        <w:t xml:space="preserve">    </w:t>
-      </w:r>
-      <w:r>
-        <w:rPr>
-          <w:rFonts w:ascii="Arial" w:hAnsi="Arial" w:cs="Arial"/>
-        </w:rPr>
-        <w:t>▼</w:t>
-      </w:r>
-    </w:p>
-    <w:p>
-      <w:r>
-        <w:t>User can click on a user OR search</w:t>
-      </w:r>
-    </w:p>
-    <w:p>
-      <w:r>
-        <w:t xml:space="preserve">    │</w:t>
-      </w:r>
-    </w:p>
-    <w:p>
-      <w:r>
-        <w:t xml:space="preserve">    </w:t>
-      </w:r>
-      <w:r>
-        <w:rPr>
-          <w:rFonts w:ascii="Arial" w:hAnsi="Arial" w:cs="Arial"/>
-        </w:rPr>
-        <w:t>▼</w:t>
-      </w:r>
-    </w:p>
-    <w:p>
-      <w:r>
-        <w:t>If user clicks: Go to Profile page</w:t>
-      </w:r>
-    </w:p>
-    <w:p>
-      <w:r>
-        <w:t xml:space="preserve">    │</w:t>
-      </w:r>
-    </w:p>
-    <w:p>
-      <w:r>
-        <w:t xml:space="preserve">    </w:t>
-      </w:r>
-      <w:r>
-        <w:rPr>
-          <w:rFonts w:ascii="Arial" w:hAnsi="Arial" w:cs="Arial"/>
-        </w:rPr>
-        <w:t>▼</w:t>
-      </w:r>
-    </w:p>
-    <w:p>
-      <w:r>
-        <w:t>END</w:t>
+      <w:r>
+        <w:t xml:space="preserve"> </w:t>
+      </w:r>
+    </w:p>
+    <w:p>
+      <w:r>
+        <w:rPr>
+          <w:noProof/>
+        </w:rPr>
+        <w:drawing>
+          <wp:inline distT="0" distB="0" distL="0" distR="0" wp14:anchorId="1214EAB8" wp14:editId="743F16B1">
+            <wp:extent cx="3553863" cy="6799153"/>
+            <wp:effectExtent l="0" t="0" r="8890" b="1905"/>
+            <wp:docPr id="1440414812" name="Picture 4"/>
+            <wp:cNvGraphicFramePr>
+              <a:graphicFrameLocks xmlns:a="http://schemas.openxmlformats.org/drawingml/2006/main" noChangeAspect="1"/>
+            </wp:cNvGraphicFramePr>
+            <a:graphic xmlns:a="http://schemas.openxmlformats.org/drawingml/2006/main">
+              <a:graphicData uri="http://schemas.openxmlformats.org/drawingml/2006/picture">
+                <pic:pic xmlns:pic="http://schemas.openxmlformats.org/drawingml/2006/picture">
+                  <pic:nvPicPr>
+                    <pic:cNvPr id="0" name="Picture 13"/>
+                    <pic:cNvPicPr>
+                      <a:picLocks noChangeAspect="1" noChangeArrowheads="1"/>
+                    </pic:cNvPicPr>
+                  </pic:nvPicPr>
+                  <pic:blipFill>
+                    <a:blip r:embed="rId13">
+                      <a:extLst>
+                        <a:ext uri="{28A0092B-C50C-407E-A947-70E740481C1C}">
+                          <a14:useLocalDpi xmlns:a14="http://schemas.microsoft.com/office/drawing/2010/main" val="0"/>
+                        </a:ext>
+                      </a:extLst>
+                    </a:blip>
+                    <a:srcRect/>
+                    <a:stretch>
+                      <a:fillRect/>
+                    </a:stretch>
+                  </pic:blipFill>
+                  <pic:spPr bwMode="auto">
+                    <a:xfrm>
+                      <a:off x="0" y="0"/>
+                      <a:ext cx="3556237" cy="6803695"/>
+                    </a:xfrm>
+                    <a:prstGeom prst="rect">
+                      <a:avLst/>
+                    </a:prstGeom>
+                    <a:noFill/>
+                    <a:ln>
+                      <a:noFill/>
+                    </a:ln>
+                  </pic:spPr>
+                </pic:pic>
+              </a:graphicData>
+            </a:graphic>
+          </wp:inline>
+        </w:drawing>
       </w:r>
     </w:p>
     <w:p/>
     <w:p/>
     <w:p/>
     <w:p/>
-    <w:p/>
-    <w:p/>
-    <w:p/>
     <w:p>
       <w:pPr>
         <w:pStyle w:val="Heading3"/>
       </w:pPr>
-      <w:bookmarkStart w:id="7" w:name="_Toc222828644"/>
-      <w:r>
-        <w:lastRenderedPageBreak/>
-        <w:t>View User Profile</w:t>
-      </w:r>
-      <w:bookmarkEnd w:id="7"/>
-    </w:p>
-    <w:p>
-      <w:r>
-        <w:t>START</w:t>
-      </w:r>
-    </w:p>
-    <w:p>
-      <w:r>
-        <w:t xml:space="preserve">    │</w:t>
-      </w:r>
-    </w:p>
-    <w:p>
-      <w:r>
-        <w:t xml:space="preserve">    </w:t>
-      </w:r>
-      <w:r>
-        <w:rPr>
-          <w:rFonts w:ascii="Arial" w:hAnsi="Arial" w:cs="Arial"/>
-        </w:rPr>
-        <w:t>▼</w:t>
-      </w:r>
-    </w:p>
-    <w:p>
-      <w:r>
-        <w:t>User clicks "View Profile" on a user</w:t>
-      </w:r>
-    </w:p>
-    <w:p>
-      <w:r>
-        <w:t xml:space="preserve">    │</w:t>
-      </w:r>
-    </w:p>
-    <w:p>
-      <w:r>
-        <w:t xml:space="preserve">    </w:t>
-      </w:r>
-      <w:r>
-        <w:rPr>
-          <w:rFonts w:ascii="Arial" w:hAnsi="Arial" w:cs="Arial"/>
-        </w:rPr>
-        <w:t>▼</w:t>
-      </w:r>
-    </w:p>
-    <w:p>
-      <w:r>
-        <w:t xml:space="preserve">System queries: SELECT * FROM users WHERE id = </w:t>
-      </w:r>
-      <w:proofErr w:type="spellStart"/>
-      <w:r>
-        <w:t>user_id</w:t>
-      </w:r>
-      <w:proofErr w:type="spellEnd"/>
-    </w:p>
-    <w:p>
-      <w:r>
-        <w:t xml:space="preserve">    │</w:t>
-      </w:r>
-    </w:p>
-    <w:p>
-      <w:r>
-        <w:t xml:space="preserve">    </w:t>
-      </w:r>
-      <w:r>
-        <w:rPr>
-          <w:rFonts w:ascii="Arial" w:hAnsi="Arial" w:cs="Arial"/>
-        </w:rPr>
-        <w:t>▼</w:t>
-      </w:r>
-    </w:p>
-    <w:p>
-      <w:r>
-        <w:t xml:space="preserve">System also queries: SELECT * FROM posts WHERE </w:t>
-      </w:r>
-      <w:proofErr w:type="spellStart"/>
-      <w:r>
-        <w:t>user_id</w:t>
-      </w:r>
-      <w:proofErr w:type="spellEnd"/>
-      <w:r>
-        <w:t xml:space="preserve"> = id</w:t>
-      </w:r>
-    </w:p>
-    <w:p>
-      <w:r>
-        <w:t xml:space="preserve">    │</w:t>
-      </w:r>
-    </w:p>
-    <w:p>
-      <w:r>
-        <w:t xml:space="preserve">    </w:t>
-      </w:r>
-      <w:r>
-        <w:rPr>
-          <w:rFonts w:ascii="Arial" w:hAnsi="Arial" w:cs="Arial"/>
-        </w:rPr>
-        <w:t>▼</w:t>
-      </w:r>
-    </w:p>
-    <w:p>
-      <w:r>
-        <w:t>System displays profile info + user's posts</w:t>
-      </w:r>
-    </w:p>
-    <w:p>
-      <w:r>
-        <w:t xml:space="preserve">    │</w:t>
-      </w:r>
-    </w:p>
-    <w:p>
-      <w:r>
-        <w:t xml:space="preserve">    </w:t>
-      </w:r>
-      <w:r>
-        <w:rPr>
-          <w:rFonts w:ascii="Arial" w:hAnsi="Arial" w:cs="Arial"/>
-        </w:rPr>
-        <w:t>▼</w:t>
-      </w:r>
-    </w:p>
-    <w:p>
-      <w:r>
-        <w:t>User can click on any post to view details</w:t>
-      </w:r>
-    </w:p>
-    <w:p>
-      <w:r>
-        <w:t xml:space="preserve">    │</w:t>
-      </w:r>
-    </w:p>
-    <w:p>
-      <w:r>
-        <w:t xml:space="preserve">    </w:t>
-      </w:r>
-      <w:r>
-        <w:rPr>
-          <w:rFonts w:ascii="Arial" w:hAnsi="Arial" w:cs="Arial"/>
-        </w:rPr>
-        <w:t>▼</w:t>
-      </w:r>
-    </w:p>
-    <w:p>
-      <w:r>
-        <w:t>END</w:t>
-      </w:r>
-    </w:p>
-    <w:p/>
-    <w:p/>
-    <w:p/>
-    <w:p/>
-    <w:p/>
-    <w:p/>
-    <w:p/>
-    <w:p/>
-    <w:p>
-      <w:pPr>
-        <w:pStyle w:val="Heading3"/>
-      </w:pPr>
-      <w:bookmarkStart w:id="8" w:name="_Toc222828645"/>
+      <w:bookmarkStart w:id="7" w:name="_Toc222838824"/>
       <w:r>
         <w:lastRenderedPageBreak/>
         <w:t>View Posts Lists</w:t>
       </w:r>
+      <w:bookmarkEnd w:id="7"/>
+    </w:p>
+    <w:p>
+      <w:r>
+        <w:rPr>
+          <w:noProof/>
+        </w:rPr>
+        <w:drawing>
+          <wp:inline distT="0" distB="0" distL="0" distR="0" wp14:anchorId="772DA96B" wp14:editId="746B1D58">
+            <wp:extent cx="5731510" cy="8147685"/>
+            <wp:effectExtent l="0" t="0" r="2540" b="5715"/>
+            <wp:docPr id="1226705079" name="Picture 2"/>
+            <wp:cNvGraphicFramePr>
+              <a:graphicFrameLocks xmlns:a="http://schemas.openxmlformats.org/drawingml/2006/main" noChangeAspect="1"/>
+            </wp:cNvGraphicFramePr>
+            <a:graphic xmlns:a="http://schemas.openxmlformats.org/drawingml/2006/main">
+              <a:graphicData uri="http://schemas.openxmlformats.org/drawingml/2006/picture">
+                <pic:pic xmlns:pic="http://schemas.openxmlformats.org/drawingml/2006/picture">
+                  <pic:nvPicPr>
+                    <pic:cNvPr id="0" name="Picture 6"/>
+                    <pic:cNvPicPr>
+                      <a:picLocks noChangeAspect="1" noChangeArrowheads="1"/>
+                    </pic:cNvPicPr>
+                  </pic:nvPicPr>
+                  <pic:blipFill>
+                    <a:blip r:embed="rId14">
+                      <a:extLst>
+                        <a:ext uri="{28A0092B-C50C-407E-A947-70E740481C1C}">
+                          <a14:useLocalDpi xmlns:a14="http://schemas.microsoft.com/office/drawing/2010/main" val="0"/>
+                        </a:ext>
+                      </a:extLst>
+                    </a:blip>
+                    <a:srcRect/>
+                    <a:stretch>
+                      <a:fillRect/>
+                    </a:stretch>
+                  </pic:blipFill>
+                  <pic:spPr bwMode="auto">
+                    <a:xfrm>
+                      <a:off x="0" y="0"/>
+                      <a:ext cx="5731510" cy="8147685"/>
+                    </a:xfrm>
+                    <a:prstGeom prst="rect">
+                      <a:avLst/>
+                    </a:prstGeom>
+                    <a:noFill/>
+                    <a:ln>
+                      <a:noFill/>
+                    </a:ln>
+                  </pic:spPr>
+                </pic:pic>
+              </a:graphicData>
+            </a:graphic>
+          </wp:inline>
+        </w:drawing>
+      </w:r>
+    </w:p>
+    <w:p/>
+    <w:p>
+      <w:pPr>
+        <w:pStyle w:val="Heading2"/>
+        <w:rPr>
+          <w:b/>
+          <w:bCs/>
+        </w:rPr>
+      </w:pPr>
+      <w:bookmarkStart w:id="8" w:name="_Toc222838825"/>
+      <w:r>
+        <w:rPr>
+          <w:b/>
+          <w:bCs/>
+        </w:rPr>
+        <w:lastRenderedPageBreak/>
+        <w:t xml:space="preserve">Section 5: </w:t>
+      </w:r>
+      <w:r>
+        <w:rPr>
+          <w:b/>
+          <w:bCs/>
+        </w:rPr>
+        <w:t>ERD diagram</w:t>
+      </w:r>
       <w:bookmarkEnd w:id="8"/>
     </w:p>
     <w:p>
-      <w:r>
-        <w:t>START</w:t>
-      </w:r>
-    </w:p>
-    <w:p>
-      <w:r>
-        <w:t xml:space="preserve">    │</w:t>
-      </w:r>
-    </w:p>
-    <w:p>
-      <w:r>
-        <w:t xml:space="preserve">    </w:t>
-      </w:r>
-      <w:r>
-        <w:rPr>
-          <w:rFonts w:ascii="Arial" w:hAnsi="Arial" w:cs="Arial"/>
-        </w:rPr>
-        <w:t>▼</w:t>
-      </w:r>
-    </w:p>
-    <w:p>
-      <w:r>
-        <w:t>User clicks "View Profile" on a user</w:t>
-      </w:r>
-    </w:p>
-    <w:p>
-      <w:r>
-        <w:t xml:space="preserve">    │</w:t>
-      </w:r>
-    </w:p>
-    <w:p>
-      <w:r>
-        <w:t xml:space="preserve">    </w:t>
-      </w:r>
-      <w:r>
-        <w:rPr>
-          <w:rFonts w:ascii="Arial" w:hAnsi="Arial" w:cs="Arial"/>
-        </w:rPr>
-        <w:t>▼</w:t>
-      </w:r>
-    </w:p>
-    <w:p>
-      <w:r>
-        <w:t xml:space="preserve">System queries: SELECT * FROM users WHERE id = </w:t>
-      </w:r>
-      <w:proofErr w:type="spellStart"/>
-      <w:r>
-        <w:t>user_id</w:t>
-      </w:r>
-      <w:proofErr w:type="spellEnd"/>
-    </w:p>
-    <w:p>
-      <w:r>
-        <w:t xml:space="preserve">    │</w:t>
-      </w:r>
-    </w:p>
-    <w:p>
-      <w:r>
-        <w:t xml:space="preserve">    </w:t>
-      </w:r>
-      <w:r>
-        <w:rPr>
-          <w:rFonts w:ascii="Arial" w:hAnsi="Arial" w:cs="Arial"/>
-        </w:rPr>
-        <w:t>▼</w:t>
-      </w:r>
-    </w:p>
-    <w:p>
-      <w:r>
-        <w:t xml:space="preserve">System also queries: SELECT * FROM posts WHERE </w:t>
-      </w:r>
-      <w:proofErr w:type="spellStart"/>
-      <w:r>
-        <w:t>user_id</w:t>
-      </w:r>
-      <w:proofErr w:type="spellEnd"/>
-      <w:r>
-        <w:t xml:space="preserve"> = id</w:t>
-      </w:r>
-    </w:p>
-    <w:p>
-      <w:r>
-        <w:t xml:space="preserve">    │</w:t>
-      </w:r>
-    </w:p>
-    <w:p>
-      <w:r>
-        <w:t xml:space="preserve">    </w:t>
-      </w:r>
-      <w:r>
-        <w:rPr>
-          <w:rFonts w:ascii="Arial" w:hAnsi="Arial" w:cs="Arial"/>
-        </w:rPr>
-        <w:t>▼</w:t>
-      </w:r>
-    </w:p>
-    <w:p>
-      <w:r>
-        <w:t>System displays profile info + user's posts</w:t>
-      </w:r>
-    </w:p>
-    <w:p>
-      <w:r>
-        <w:t xml:space="preserve">    │</w:t>
-      </w:r>
-    </w:p>
-    <w:p>
-      <w:r>
-        <w:t xml:space="preserve">    </w:t>
-      </w:r>
-      <w:r>
-        <w:rPr>
-          <w:rFonts w:ascii="Arial" w:hAnsi="Arial" w:cs="Arial"/>
-        </w:rPr>
-        <w:t>▼</w:t>
-      </w:r>
-    </w:p>
-    <w:p>
-      <w:r>
-        <w:t>User can click on any post to view details</w:t>
-      </w:r>
-    </w:p>
-    <w:p>
-      <w:r>
-        <w:t xml:space="preserve">    │</w:t>
-      </w:r>
-    </w:p>
-    <w:p>
-      <w:r>
-        <w:t xml:space="preserve">    </w:t>
-      </w:r>
-      <w:r>
-        <w:rPr>
-          <w:rFonts w:ascii="Arial" w:hAnsi="Arial" w:cs="Arial"/>
-        </w:rPr>
-        <w:t>▼</w:t>
-      </w:r>
-    </w:p>
-    <w:p>
-      <w:r>
-        <w:t>END</w:t>
-      </w:r>
+      <w:pPr>
+        <w:rPr>
+          <w:b/>
+          <w:bCs/>
+        </w:rPr>
+      </w:pPr>
+      <w:r>
+        <w:rPr>
+          <w:b/>
+          <w:bCs/>
+          <w:noProof/>
+        </w:rPr>
+        <w:drawing>
+          <wp:inline distT="0" distB="0" distL="0" distR="0" wp14:anchorId="466480F1" wp14:editId="4CF7D143">
+            <wp:extent cx="4139565" cy="7351414"/>
+            <wp:effectExtent l="0" t="0" r="0" b="1905"/>
+            <wp:docPr id="1944674417" name="Picture 7"/>
+            <wp:cNvGraphicFramePr>
+              <a:graphicFrameLocks xmlns:a="http://schemas.openxmlformats.org/drawingml/2006/main" noChangeAspect="1"/>
+            </wp:cNvGraphicFramePr>
+            <a:graphic xmlns:a="http://schemas.openxmlformats.org/drawingml/2006/main">
+              <a:graphicData uri="http://schemas.openxmlformats.org/drawingml/2006/picture">
+                <pic:pic xmlns:pic="http://schemas.openxmlformats.org/drawingml/2006/picture">
+                  <pic:nvPicPr>
+                    <pic:cNvPr id="0" name="Picture 22"/>
+                    <pic:cNvPicPr>
+                      <a:picLocks noChangeAspect="1" noChangeArrowheads="1"/>
+                    </pic:cNvPicPr>
+                  </pic:nvPicPr>
+                  <pic:blipFill>
+                    <a:blip r:embed="rId15">
+                      <a:extLst>
+                        <a:ext uri="{28A0092B-C50C-407E-A947-70E740481C1C}">
+                          <a14:useLocalDpi xmlns:a14="http://schemas.microsoft.com/office/drawing/2010/main" val="0"/>
+                        </a:ext>
+                      </a:extLst>
+                    </a:blip>
+                    <a:srcRect/>
+                    <a:stretch>
+                      <a:fillRect/>
+                    </a:stretch>
+                  </pic:blipFill>
+                  <pic:spPr bwMode="auto">
+                    <a:xfrm>
+                      <a:off x="0" y="0"/>
+                      <a:ext cx="4140148" cy="7352450"/>
+                    </a:xfrm>
+                    <a:prstGeom prst="rect">
+                      <a:avLst/>
+                    </a:prstGeom>
+                    <a:noFill/>
+                    <a:ln>
+                      <a:noFill/>
+                    </a:ln>
+                  </pic:spPr>
+                </pic:pic>
+              </a:graphicData>
+            </a:graphic>
+          </wp:inline>
+        </w:drawing>
+      </w:r>
+    </w:p>
+    <w:p>
+      <w:pPr>
+        <w:rPr>
+          <w:b/>
+          <w:bCs/>
+        </w:rPr>
+      </w:pPr>
     </w:p>
     <w:p/>
-    <w:p/>
-    <w:p/>
-    <w:p/>
-    <w:p/>
-    <w:p/>
-    <w:p/>
-    <w:p/>
-    <w:p>
-      <w:pPr>
-        <w:pStyle w:val="Heading3"/>
-      </w:pPr>
-      <w:bookmarkStart w:id="9" w:name="_Toc222828646"/>
-      <w:r>
-        <w:lastRenderedPageBreak/>
-        <w:t>View Post Details</w:t>
-      </w:r>
-      <w:bookmarkEnd w:id="9"/>
-    </w:p>
-    <w:p>
-      <w:r>
-        <w:t>START</w:t>
-      </w:r>
-    </w:p>
-    <w:p>
-      <w:r>
-        <w:t xml:space="preserve">    │</w:t>
-      </w:r>
-    </w:p>
-    <w:p>
-      <w:r>
-        <w:t xml:space="preserve">    </w:t>
-      </w:r>
-      <w:r>
-        <w:rPr>
-          <w:rFonts w:ascii="Arial" w:hAnsi="Arial" w:cs="Arial"/>
-        </w:rPr>
-        <w:t>▼</w:t>
-      </w:r>
-    </w:p>
-    <w:p>
-      <w:r>
-        <w:t>User clicks "Read More" on a post</w:t>
-      </w:r>
-    </w:p>
-    <w:p>
-      <w:r>
-        <w:t xml:space="preserve">    │</w:t>
-      </w:r>
-    </w:p>
-    <w:p>
-      <w:r>
-        <w:t xml:space="preserve">    </w:t>
-      </w:r>
-      <w:r>
-        <w:rPr>
-          <w:rFonts w:ascii="Arial" w:hAnsi="Arial" w:cs="Arial"/>
-        </w:rPr>
-        <w:t>▼</w:t>
-      </w:r>
-    </w:p>
-    <w:p>
-      <w:r>
-        <w:t xml:space="preserve">System queries: SELECT * FROM posts WHERE id = </w:t>
-      </w:r>
-      <w:proofErr w:type="spellStart"/>
-      <w:r>
-        <w:t>post_id</w:t>
-      </w:r>
-      <w:proofErr w:type="spellEnd"/>
-    </w:p>
-    <w:p>
-      <w:r>
-        <w:t xml:space="preserve">    │</w:t>
-      </w:r>
-    </w:p>
-    <w:p>
-      <w:r>
-        <w:t xml:space="preserve">    </w:t>
-      </w:r>
-      <w:r>
-        <w:rPr>
-          <w:rFonts w:ascii="Arial" w:hAnsi="Arial" w:cs="Arial"/>
-        </w:rPr>
-        <w:t>▼</w:t>
-      </w:r>
-    </w:p>
-    <w:p>
-      <w:r>
-        <w:t xml:space="preserve">System queries: SELECT * FROM users WHERE id = </w:t>
-      </w:r>
-      <w:proofErr w:type="spellStart"/>
-      <w:r>
-        <w:t>author_id</w:t>
-      </w:r>
-      <w:proofErr w:type="spellEnd"/>
-    </w:p>
-    <w:p>
-      <w:r>
-        <w:t xml:space="preserve">    │</w:t>
-      </w:r>
-    </w:p>
-    <w:p>
-      <w:r>
-        <w:t xml:space="preserve">    </w:t>
-      </w:r>
-      <w:r>
-        <w:rPr>
-          <w:rFonts w:ascii="Arial" w:hAnsi="Arial" w:cs="Arial"/>
-        </w:rPr>
-        <w:t>▼</w:t>
-      </w:r>
-    </w:p>
-    <w:p>
-      <w:r>
-        <w:t xml:space="preserve">System queries: SELECT * FROM comments WHERE </w:t>
-      </w:r>
-      <w:proofErr w:type="spellStart"/>
-      <w:r>
-        <w:t>post_id</w:t>
-      </w:r>
-      <w:proofErr w:type="spellEnd"/>
-      <w:r>
-        <w:t xml:space="preserve"> = </w:t>
-      </w:r>
-      <w:proofErr w:type="spellStart"/>
-      <w:r>
-        <w:t>post_id</w:t>
-      </w:r>
-      <w:proofErr w:type="spellEnd"/>
-    </w:p>
-    <w:p>
-      <w:r>
-        <w:t xml:space="preserve">    │</w:t>
-      </w:r>
-    </w:p>
-    <w:p>
-      <w:r>
-        <w:t xml:space="preserve">    </w:t>
-      </w:r>
-      <w:r>
-        <w:rPr>
-          <w:rFonts w:ascii="Arial" w:hAnsi="Arial" w:cs="Arial"/>
-        </w:rPr>
-        <w:t>▼</w:t>
-      </w:r>
-    </w:p>
-    <w:p>
-      <w:r>
-        <w:t>System displays full post + author info + comments</w:t>
-      </w:r>
-    </w:p>
-    <w:p>
-      <w:r>
-        <w:t xml:space="preserve">    │</w:t>
-      </w:r>
-    </w:p>
-    <w:p>
-      <w:r>
-        <w:t xml:space="preserve">    </w:t>
-      </w:r>
-      <w:r>
-        <w:rPr>
-          <w:rFonts w:ascii="Arial" w:hAnsi="Arial" w:cs="Arial"/>
-        </w:rPr>
-        <w:t>▼</w:t>
-      </w:r>
-    </w:p>
-    <w:p>
-      <w:r>
-        <w:t>END</w:t>
-      </w:r>
-    </w:p>
-    <w:p/>
-    <w:p/>
-    <w:p/>
-    <w:p/>
-    <w:p/>
-    <w:p/>
-    <w:p/>
-    <w:p/>
-    <w:p>
-      <w:pPr>
-        <w:pStyle w:val="Heading3"/>
-      </w:pPr>
-      <w:bookmarkStart w:id="10" w:name="_Toc222828647"/>
-      <w:r>
-        <w:lastRenderedPageBreak/>
-        <w:t>Filter By Category</w:t>
-      </w:r>
-      <w:bookmarkEnd w:id="10"/>
-    </w:p>
-    <w:p>
-      <w:r>
-        <w:t>START</w:t>
-      </w:r>
-    </w:p>
-    <w:p>
-      <w:r>
-        <w:t xml:space="preserve">    │</w:t>
-      </w:r>
-    </w:p>
-    <w:p>
-      <w:r>
-        <w:t xml:space="preserve">    </w:t>
-      </w:r>
-      <w:r>
-        <w:rPr>
-          <w:rFonts w:ascii="Arial" w:hAnsi="Arial" w:cs="Arial"/>
-        </w:rPr>
-        <w:t>▼</w:t>
-      </w:r>
-    </w:p>
-    <w:p>
-      <w:r>
-        <w:t>User is on Posts List page</w:t>
-      </w:r>
-    </w:p>
-    <w:p>
-      <w:r>
-        <w:t xml:space="preserve">    │</w:t>
-      </w:r>
-    </w:p>
-    <w:p>
-      <w:r>
-        <w:t xml:space="preserve">    </w:t>
-      </w:r>
-      <w:r>
-        <w:rPr>
-          <w:rFonts w:ascii="Arial" w:hAnsi="Arial" w:cs="Arial"/>
-        </w:rPr>
-        <w:t>▼</w:t>
-      </w:r>
-    </w:p>
-    <w:p>
-      <w:r>
-        <w:t>User clicks category button (e.g., "Food")</w:t>
-      </w:r>
-    </w:p>
-    <w:p>
-      <w:r>
-        <w:t xml:space="preserve">    │</w:t>
-      </w:r>
-    </w:p>
-    <w:p>
-      <w:r>
-        <w:t xml:space="preserve">    </w:t>
-      </w:r>
-      <w:r>
-        <w:rPr>
-          <w:rFonts w:ascii="Arial" w:hAnsi="Arial" w:cs="Arial"/>
-        </w:rPr>
-        <w:t>▼</w:t>
-      </w:r>
-    </w:p>
-    <w:p>
-      <w:r>
-        <w:t>System queries: SELECT * FROM posts WHERE category = 'Food'</w:t>
-      </w:r>
-    </w:p>
-    <w:p>
-      <w:r>
-        <w:t xml:space="preserve">    │</w:t>
-      </w:r>
-    </w:p>
-    <w:p>
-      <w:r>
-        <w:t xml:space="preserve">    </w:t>
-      </w:r>
-      <w:r>
-        <w:rPr>
-          <w:rFonts w:ascii="Arial" w:hAnsi="Arial" w:cs="Arial"/>
-        </w:rPr>
-        <w:t>▼</w:t>
-      </w:r>
-    </w:p>
-    <w:p>
-      <w:r>
-        <w:t>System displays only posts in that category</w:t>
-      </w:r>
-    </w:p>
-    <w:p>
-      <w:r>
-        <w:t xml:space="preserve">    │</w:t>
-      </w:r>
-    </w:p>
-    <w:p>
-      <w:r>
-        <w:t xml:space="preserve">    </w:t>
-      </w:r>
-      <w:r>
-        <w:rPr>
-          <w:rFonts w:ascii="Arial" w:hAnsi="Arial" w:cs="Arial"/>
-        </w:rPr>
-        <w:t>▼</w:t>
-      </w:r>
-    </w:p>
-    <w:p>
-      <w:r>
-        <w:t>User can view posts or clear filter</w:t>
-      </w:r>
-    </w:p>
-    <w:p>
-      <w:r>
-        <w:t xml:space="preserve">    │</w:t>
-      </w:r>
-    </w:p>
-    <w:p>
-      <w:r>
-        <w:t xml:space="preserve">    </w:t>
-      </w:r>
-      <w:r>
-        <w:rPr>
-          <w:rFonts w:ascii="Arial" w:hAnsi="Arial" w:cs="Arial"/>
-        </w:rPr>
-        <w:t>▼</w:t>
-      </w:r>
-    </w:p>
-    <w:p>
-      <w:r>
-        <w:t>END</w:t>
-      </w:r>
-    </w:p>
-    <w:p/>
-    <w:p/>
-    <w:p/>
-    <w:p/>
-    <w:p/>
-    <w:p/>
-    <w:p/>
-    <w:p/>
     <w:p>
       <w:pPr>
         <w:pStyle w:val="Heading2"/>
@@ -2731,7 +2033,7 @@
           <w:bCs/>
         </w:rPr>
       </w:pPr>
-      <w:bookmarkStart w:id="11" w:name="_Toc222828648"/>
+      <w:bookmarkStart w:id="9" w:name="_Toc222838826"/>
       <w:r>
         <w:rPr>
           <w:b/>
@@ -2740,7 +2042,7 @@
         <w:lastRenderedPageBreak/>
         <w:t>Section 6: Kanban Board Screenshot</w:t>
       </w:r>
-      <w:bookmarkEnd w:id="11"/>
+      <w:bookmarkEnd w:id="9"/>
     </w:p>
     <w:p>
       <w:r>
@@ -2765,7 +2067,7 @@
                     </pic:cNvPicPr>
                   </pic:nvPicPr>
                   <pic:blipFill>
-                    <a:blip r:embed="rId11" cstate="print">
+                    <a:blip r:embed="rId16" cstate="print">
                       <a:extLst>
                         <a:ext uri="{28A0092B-C50C-407E-A947-70E740481C1C}">
                           <a14:useLocalDpi xmlns:a14="http://schemas.microsoft.com/office/drawing/2010/main" val="0"/>
@@ -2806,7 +2108,7 @@
           <w:bCs/>
         </w:rPr>
       </w:pPr>
-      <w:bookmarkStart w:id="12" w:name="_Toc222828649"/>
+      <w:bookmarkStart w:id="10" w:name="_Toc222838827"/>
       <w:r>
         <w:rPr>
           <w:b/>
@@ -2814,7 +2116,7 @@
         </w:rPr>
         <w:t>Section 7: Meeting Records</w:t>
       </w:r>
-      <w:bookmarkEnd w:id="12"/>
+      <w:bookmarkEnd w:id="10"/>
     </w:p>
     <w:p>
       <w:r>
@@ -2881,6 +2183,56 @@
     </w:sectPr>
   </w:body>
 </w:document>
+</file>
+
+<file path=word/endnotes.xml><?xml version="1.0" encoding="utf-8"?>
+<w:endnotes xmlns:wpc="http://schemas.microsoft.com/office/word/2010/wordprocessingCanvas" xmlns:cx="http://schemas.microsoft.com/office/drawing/2014/chartex" xmlns:cx1="http://schemas.microsoft.com/office/drawing/2015/9/8/chartex" xmlns:cx2="http://schemas.microsoft.com/office/drawing/2015/10/21/chartex" xmlns:cx3="http://schemas.microsoft.com/office/drawing/2016/5/9/chartex" xmlns:cx4="http://schemas.microsoft.com/office/drawing/2016/5/10/chartex" xmlns:cx5="http://schemas.microsoft.com/office/drawing/2016/5/11/chartex" xmlns:cx6="http://schemas.microsoft.com/office/drawing/2016/5/12/chartex" xmlns:cx7="http://schemas.microsoft.com/office/drawing/2016/5/13/chartex" xmlns:cx8="http://schemas.microsoft.com/office/drawing/2016/5/14/chartex" xmlns:mc="http://schemas.openxmlformats.org/markup-compatibility/2006" xmlns:aink="http://schemas.microsoft.com/office/drawing/2016/ink" xmlns:am3d="http://schemas.microsoft.com/office/drawing/2017/model3d" xmlns:o="urn:schemas-microsoft-com:office:office" xmlns:oel="http://schemas.microsoft.com/office/2019/extlst" xmlns:r="http://schemas.openxmlformats.org/officeDocument/2006/relationships" xmlns:m="http://schemas.openxmlformats.org/officeDocument/2006/math" xmlns:v="urn:schemas-microsoft-com:vml" xmlns:wp14="http://schemas.microsoft.com/office/word/2010/wordprocessingDrawing" xmlns:wp="http://schemas.openxmlformats.org/drawingml/2006/wordprocessingDrawing" xmlns:w10="urn:schemas-microsoft-com:office:word" xmlns:w="http://schemas.openxmlformats.org/wordprocessingml/2006/main" xmlns:w14="http://schemas.microsoft.com/office/word/2010/wordml" xmlns:w15="http://schemas.microsoft.com/office/word/2012/wordml" xmlns:w16cex="http://schemas.microsoft.com/office/word/2018/wordml/cex" xmlns:w16cid="http://schemas.microsoft.com/office/word/2016/wordml/cid" xmlns:w16="http://schemas.microsoft.com/office/word/2018/wordml" xmlns:w16du="http://schemas.microsoft.com/office/word/2023/wordml/word16du" xmlns:w16sdtdh="http://schemas.microsoft.com/office/word/2020/wordml/sdtdatahash" xmlns:w16sdtfl="http://schemas.microsoft.com/office/word/2024/wordml/sdtformatlock" xmlns:w16se="http://schemas.microsoft.com/office/word/2015/wordml/symex" xmlns:wpg="http://schemas.microsoft.com/office/word/2010/wordprocessingGroup" xmlns:wpi="http://schemas.microsoft.com/office/word/2010/wordprocessingInk" xmlns:wne="http://schemas.microsoft.com/office/word/2006/wordml" xmlns:wps="http://schemas.microsoft.com/office/word/2010/wordprocessingShape" mc:Ignorable="w14 w15 w16se w16cid w16 w16cex w16sdtdh w16sdtfl w16du wp14">
+  <w:endnote w:type="separator" w:id="-1">
+    <w:p>
+      <w:pPr>
+        <w:spacing w:after="0" w:line="240" w:lineRule="auto"/>
+      </w:pPr>
+      <w:r>
+        <w:separator/>
+      </w:r>
+    </w:p>
+  </w:endnote>
+  <w:endnote w:type="continuationSeparator" w:id="0">
+    <w:p>
+      <w:pPr>
+        <w:spacing w:after="0" w:line="240" w:lineRule="auto"/>
+      </w:pPr>
+      <w:r>
+        <w:continuationSeparator/>
+      </w:r>
+    </w:p>
+  </w:endnote>
+</w:endnotes>
+</file>
+
+<file path=word/footnotes.xml><?xml version="1.0" encoding="utf-8"?>
+<w:footnotes xmlns:wpc="http://schemas.microsoft.com/office/word/2010/wordprocessingCanvas" xmlns:cx="http://schemas.microsoft.com/office/drawing/2014/chartex" xmlns:cx1="http://schemas.microsoft.com/office/drawing/2015/9/8/chartex" xmlns:cx2="http://schemas.microsoft.com/office/drawing/2015/10/21/chartex" xmlns:cx3="http://schemas.microsoft.com/office/drawing/2016/5/9/chartex" xmlns:cx4="http://schemas.microsoft.com/office/drawing/2016/5/10/chartex" xmlns:cx5="http://schemas.microsoft.com/office/drawing/2016/5/11/chartex" xmlns:cx6="http://schemas.microsoft.com/office/drawing/2016/5/12/chartex" xmlns:cx7="http://schemas.microsoft.com/office/drawing/2016/5/13/chartex" xmlns:cx8="http://schemas.microsoft.com/office/drawing/2016/5/14/chartex" xmlns:mc="http://schemas.openxmlformats.org/markup-compatibility/2006" xmlns:aink="http://schemas.microsoft.com/office/drawing/2016/ink" xmlns:am3d="http://schemas.microsoft.com/office/drawing/2017/model3d" xmlns:o="urn:schemas-microsoft-com:office:office" xmlns:oel="http://schemas.microsoft.com/office/2019/extlst" xmlns:r="http://schemas.openxmlformats.org/officeDocument/2006/relationships" xmlns:m="http://schemas.openxmlformats.org/officeDocument/2006/math" xmlns:v="urn:schemas-microsoft-com:vml" xmlns:wp14="http://schemas.microsoft.com/office/word/2010/wordprocessingDrawing" xmlns:wp="http://schemas.openxmlformats.org/drawingml/2006/wordprocessingDrawing" xmlns:w10="urn:schemas-microsoft-com:office:word" xmlns:w="http://schemas.openxmlformats.org/wordprocessingml/2006/main" xmlns:w14="http://schemas.microsoft.com/office/word/2010/wordml" xmlns:w15="http://schemas.microsoft.com/office/word/2012/wordml" xmlns:w16cex="http://schemas.microsoft.com/office/word/2018/wordml/cex" xmlns:w16cid="http://schemas.microsoft.com/office/word/2016/wordml/cid" xmlns:w16="http://schemas.microsoft.com/office/word/2018/wordml" xmlns:w16du="http://schemas.microsoft.com/office/word/2023/wordml/word16du" xmlns:w16sdtdh="http://schemas.microsoft.com/office/word/2020/wordml/sdtdatahash" xmlns:w16sdtfl="http://schemas.microsoft.com/office/word/2024/wordml/sdtformatlock" xmlns:w16se="http://schemas.microsoft.com/office/word/2015/wordml/symex" xmlns:wpg="http://schemas.microsoft.com/office/word/2010/wordprocessingGroup" xmlns:wpi="http://schemas.microsoft.com/office/word/2010/wordprocessingInk" xmlns:wne="http://schemas.microsoft.com/office/word/2006/wordml" xmlns:wps="http://schemas.microsoft.com/office/word/2010/wordprocessingShape" mc:Ignorable="w14 w15 w16se w16cid w16 w16cex w16sdtdh w16sdtfl w16du wp14">
+  <w:footnote w:type="separator" w:id="-1">
+    <w:p>
+      <w:pPr>
+        <w:spacing w:after="0" w:line="240" w:lineRule="auto"/>
+      </w:pPr>
+      <w:r>
+        <w:separator/>
+      </w:r>
+    </w:p>
+  </w:footnote>
+  <w:footnote w:type="continuationSeparator" w:id="0">
+    <w:p>
+      <w:pPr>
+        <w:spacing w:after="0" w:line="240" w:lineRule="auto"/>
+      </w:pPr>
+      <w:r>
+        <w:continuationSeparator/>
+      </w:r>
+    </w:p>
+  </w:footnote>
+</w:footnotes>
 </file>
 
 <file path=word/numbering.xml><?xml version="1.0" encoding="utf-8"?>
@@ -4004,6 +3356,50 @@
       </w:tblBorders>
     </w:tblPr>
   </w:style>
+  <w:style w:type="paragraph" w:styleId="Header">
+    <w:name w:val="header"/>
+    <w:basedOn w:val="Normal"/>
+    <w:link w:val="HeaderChar"/>
+    <w:uiPriority w:val="99"/>
+    <w:unhideWhenUsed/>
+    <w:rsid w:val="00F864B2"/>
+    <w:pPr>
+      <w:tabs>
+        <w:tab w:val="center" w:pos="4513"/>
+        <w:tab w:val="right" w:pos="9026"/>
+      </w:tabs>
+      <w:spacing w:after="0" w:line="240" w:lineRule="auto"/>
+    </w:pPr>
+  </w:style>
+  <w:style w:type="character" w:customStyle="1" w:styleId="HeaderChar">
+    <w:name w:val="Header Char"/>
+    <w:basedOn w:val="DefaultParagraphFont"/>
+    <w:link w:val="Header"/>
+    <w:uiPriority w:val="99"/>
+    <w:rsid w:val="00F864B2"/>
+  </w:style>
+  <w:style w:type="paragraph" w:styleId="Footer">
+    <w:name w:val="footer"/>
+    <w:basedOn w:val="Normal"/>
+    <w:link w:val="FooterChar"/>
+    <w:uiPriority w:val="99"/>
+    <w:unhideWhenUsed/>
+    <w:rsid w:val="00F864B2"/>
+    <w:pPr>
+      <w:tabs>
+        <w:tab w:val="center" w:pos="4513"/>
+        <w:tab w:val="right" w:pos="9026"/>
+      </w:tabs>
+      <w:spacing w:after="0" w:line="240" w:lineRule="auto"/>
+    </w:pPr>
+  </w:style>
+  <w:style w:type="character" w:customStyle="1" w:styleId="FooterChar">
+    <w:name w:val="Footer Char"/>
+    <w:basedOn w:val="DefaultParagraphFont"/>
+    <w:link w:val="Footer"/>
+    <w:uiPriority w:val="99"/>
+    <w:rsid w:val="00F864B2"/>
+  </w:style>
 </w:styles>
 </file>
 

</xml_diff>